<commit_message>
Update 08/01/2026: Web Projects
</commit_message>
<xml_diff>
--- a/Publishing-a-Quarto-Site-to-GitHub-Pages.docx
+++ b/Publishing-a-Quarto-Site-to-GitHub-Pages.docx
@@ -17,11 +17,9 @@
         </w:rPr>
         <w:t>PUBLISHING A QUARTO SITE</w:t>
       </w:r>
-    </w:p>
-    <w:p>
-      <w:pPr>
-        <w:spacing w:after="40"/>
-      </w:pPr>
+      <w:r>
+        <w:t xml:space="preserve"> </w:t>
+      </w:r>
       <w:r>
         <w:rPr>
           <w:rFonts w:ascii="Calibri" w:eastAsia="Calibri" w:hAnsi="Calibri" w:cs="Calibri"/>
@@ -192,15 +190,7 @@
           <w:sz w:val="22"/>
           <w:szCs w:val="22"/>
         </w:rPr>
-        <w:t xml:space="preserve"> – </w:t>
-      </w:r>
-      <w:r>
-        <w:rPr>
-          <w:rFonts w:ascii="Calibri" w:eastAsia="Calibri" w:hAnsi="Calibri" w:cs="Calibri"/>
-          <w:sz w:val="22"/>
-          <w:szCs w:val="22"/>
-        </w:rPr>
-        <w:t>VS Code, Positron</w:t>
+        <w:t xml:space="preserve"> – VS Code, Positron</w:t>
       </w:r>
       <w:r>
         <w:rPr>
@@ -339,63 +329,7 @@
           <w:szCs w:val="22"/>
         </w:rPr>
         <w:br/>
-        <w:t>Once that’s done, c</w:t>
-      </w:r>
-      <w:r>
-        <w:rPr>
-          <w:rFonts w:ascii="Calibri" w:eastAsia="Calibri" w:hAnsi="Calibri" w:cs="Calibri"/>
-          <w:sz w:val="22"/>
-          <w:szCs w:val="22"/>
-        </w:rPr>
-        <w:t>reate a new repository</w:t>
-      </w:r>
-      <w:r>
-        <w:rPr>
-          <w:rFonts w:ascii="Calibri" w:eastAsia="Calibri" w:hAnsi="Calibri" w:cs="Calibri"/>
-          <w:sz w:val="22"/>
-          <w:szCs w:val="22"/>
-        </w:rPr>
-        <w:t xml:space="preserve"> (“repo”)</w:t>
-      </w:r>
-      <w:r>
-        <w:rPr>
-          <w:rFonts w:ascii="Calibri" w:eastAsia="Calibri" w:hAnsi="Calibri" w:cs="Calibri"/>
-          <w:sz w:val="22"/>
-          <w:szCs w:val="22"/>
-        </w:rPr>
-        <w:t xml:space="preserve">. </w:t>
-      </w:r>
-      <w:r>
-        <w:rPr>
-          <w:rFonts w:ascii="Calibri" w:eastAsia="Calibri" w:hAnsi="Calibri" w:cs="Calibri"/>
-          <w:sz w:val="22"/>
-          <w:szCs w:val="22"/>
-        </w:rPr>
-        <w:t>The standard</w:t>
-      </w:r>
-      <w:r>
-        <w:rPr>
-          <w:rFonts w:ascii="Calibri" w:eastAsia="Calibri" w:hAnsi="Calibri" w:cs="Calibri"/>
-          <w:sz w:val="22"/>
-          <w:szCs w:val="22"/>
-        </w:rPr>
-        <w:t xml:space="preserve"> root address</w:t>
-      </w:r>
-      <w:r>
-        <w:rPr>
-          <w:rFonts w:ascii="Calibri" w:eastAsia="Calibri" w:hAnsi="Calibri" w:cs="Calibri"/>
-          <w:sz w:val="22"/>
-          <w:szCs w:val="22"/>
-        </w:rPr>
-        <w:t xml:space="preserve"> is</w:t>
-      </w:r>
-      <w:r>
-        <w:rPr>
-          <w:rFonts w:ascii="Calibri" w:eastAsia="Calibri" w:hAnsi="Calibri" w:cs="Calibri"/>
-          <w:sz w:val="22"/>
-          <w:szCs w:val="22"/>
-        </w:rPr>
-        <w:t xml:space="preserve"> &lt;your-username</w:t>
+        <w:t>Once that’s done, create a new repository (“repo”). The standard root address is &lt;your-username</w:t>
       </w:r>
       <w:proofErr w:type="gramStart"/>
       <w:r>
@@ -413,23 +347,7 @@
           <w:sz w:val="22"/>
           <w:szCs w:val="22"/>
         </w:rPr>
-        <w:t xml:space="preserve">, </w:t>
-      </w:r>
-      <w:r>
-        <w:rPr>
-          <w:rFonts w:ascii="Calibri" w:eastAsia="Calibri" w:hAnsi="Calibri" w:cs="Calibri"/>
-          <w:sz w:val="22"/>
-          <w:szCs w:val="22"/>
-        </w:rPr>
-        <w:t xml:space="preserve">so </w:t>
-      </w:r>
-      <w:r>
-        <w:rPr>
-          <w:rFonts w:ascii="Calibri" w:eastAsia="Calibri" w:hAnsi="Calibri" w:cs="Calibri"/>
-          <w:sz w:val="22"/>
-          <w:szCs w:val="22"/>
-        </w:rPr>
-        <w:t>name the repository exactly that — GitHub treats that name as special and serves it at the root domain. Any other name publishes as a project site, nested at &lt;your-username</w:t>
+        <w:t>, so name the repository exactly that — GitHub treats that name as special and serves it at the root domain. Any other name publishes as a project site, nested at &lt;your-username</w:t>
       </w:r>
       <w:proofErr w:type="gramStart"/>
       <w:r>
@@ -590,67 +508,42 @@
           <w:color w:val="1A1A1A"/>
         </w:rPr>
       </w:pPr>
+      <w:r>
+        <w:rPr>
+          <w:rFonts w:ascii="Consolas" w:eastAsia="Consolas" w:hAnsi="Consolas" w:cs="Consolas"/>
+          <w:color w:val="1A1A1A"/>
+        </w:rPr>
+        <w:t>site-</w:t>
+      </w:r>
+      <w:proofErr w:type="spellStart"/>
+      <w:r>
+        <w:rPr>
+          <w:rFonts w:ascii="Consolas" w:eastAsia="Consolas" w:hAnsi="Consolas" w:cs="Consolas"/>
+          <w:color w:val="1A1A1A"/>
+        </w:rPr>
+        <w:t>url</w:t>
+      </w:r>
+      <w:proofErr w:type="spellEnd"/>
+      <w:r>
+        <w:rPr>
+          <w:rFonts w:ascii="Consolas" w:eastAsia="Consolas" w:hAnsi="Consolas" w:cs="Consolas"/>
+          <w:color w:val="1A1A1A"/>
+        </w:rPr>
+        <w:t>: "https://&lt;your-username</w:t>
+      </w:r>
       <w:proofErr w:type="gramStart"/>
       <w:r>
         <w:rPr>
           <w:rFonts w:ascii="Consolas" w:eastAsia="Consolas" w:hAnsi="Consolas" w:cs="Consolas"/>
           <w:color w:val="1A1A1A"/>
-          <w:lang w:val="fr-FR"/>
-        </w:rPr>
-        <w:t>site</w:t>
+        </w:rPr>
+        <w:t>&gt;.github.io</w:t>
       </w:r>
       <w:proofErr w:type="gramEnd"/>
       <w:r>
         <w:rPr>
           <w:rFonts w:ascii="Consolas" w:eastAsia="Consolas" w:hAnsi="Consolas" w:cs="Consolas"/>
           <w:color w:val="1A1A1A"/>
-          <w:lang w:val="fr-FR"/>
-        </w:rPr>
-        <w:t>-</w:t>
-      </w:r>
-      <w:proofErr w:type="gramStart"/>
-      <w:r>
-        <w:rPr>
-          <w:rFonts w:ascii="Consolas" w:eastAsia="Consolas" w:hAnsi="Consolas" w:cs="Consolas"/>
-          <w:color w:val="1A1A1A"/>
-          <w:lang w:val="fr-FR"/>
-        </w:rPr>
-        <w:t>url:</w:t>
-      </w:r>
-      <w:proofErr w:type="gramEnd"/>
-      <w:r>
-        <w:rPr>
-          <w:rFonts w:ascii="Consolas" w:eastAsia="Consolas" w:hAnsi="Consolas" w:cs="Consolas"/>
-          <w:color w:val="1A1A1A"/>
-          <w:lang w:val="fr-FR"/>
-        </w:rPr>
-        <w:t xml:space="preserve"> "https://&lt;</w:t>
-      </w:r>
-      <w:proofErr w:type="spellStart"/>
-      <w:r>
-        <w:rPr>
-          <w:rFonts w:ascii="Consolas" w:eastAsia="Consolas" w:hAnsi="Consolas" w:cs="Consolas"/>
-          <w:color w:val="1A1A1A"/>
-          <w:lang w:val="fr-FR"/>
-        </w:rPr>
-        <w:t>your-username</w:t>
-      </w:r>
-      <w:proofErr w:type="spellEnd"/>
-      <w:proofErr w:type="gramStart"/>
-      <w:r>
-        <w:rPr>
-          <w:rFonts w:ascii="Consolas" w:eastAsia="Consolas" w:hAnsi="Consolas" w:cs="Consolas"/>
-          <w:color w:val="1A1A1A"/>
-          <w:lang w:val="fr-FR"/>
-        </w:rPr>
-        <w:t>&gt;.github.io</w:t>
-      </w:r>
-      <w:proofErr w:type="gramEnd"/>
-      <w:r>
-        <w:rPr>
-          <w:rFonts w:ascii="Consolas" w:eastAsia="Consolas" w:hAnsi="Consolas" w:cs="Consolas"/>
-          <w:color w:val="1A1A1A"/>
-          <w:lang w:val="fr-FR"/>
         </w:rPr>
         <w:t>/"</w:t>
       </w:r>
@@ -1568,15 +1461,7 @@
           <w:sz w:val="22"/>
           <w:szCs w:val="22"/>
         </w:rPr>
-        <w:t xml:space="preserve">: </w:t>
-      </w:r>
-      <w:r>
-        <w:rPr>
-          <w:rFonts w:ascii="Calibri" w:eastAsia="Calibri" w:hAnsi="Calibri" w:cs="Calibri"/>
-          <w:sz w:val="22"/>
-          <w:szCs w:val="22"/>
-        </w:rPr>
-        <w:t xml:space="preserve">In your repository, go to Settings → Pages and confirm the source is set to "Deploy from a branch" with </w:t>
+        <w:t xml:space="preserve">: In your repository, go to Settings → Pages and confirm the source is set to "Deploy from a branch" with </w:t>
       </w:r>
       <w:proofErr w:type="spellStart"/>
       <w:r>
@@ -1648,31 +1533,7 @@
           <w:sz w:val="22"/>
           <w:szCs w:val="22"/>
         </w:rPr>
-        <w:t>https://github.com/</w:t>
-      </w:r>
-      <w:r>
-        <w:rPr>
-          <w:rFonts w:ascii="Calibri" w:eastAsia="Calibri" w:hAnsi="Calibri" w:cs="Calibri"/>
-          <w:sz w:val="22"/>
-          <w:szCs w:val="22"/>
-        </w:rPr>
-        <w:t>&lt;user.name&gt;</w:t>
-      </w:r>
-      <w:r>
-        <w:rPr>
-          <w:rFonts w:ascii="Calibri" w:eastAsia="Calibri" w:hAnsi="Calibri" w:cs="Calibri"/>
-          <w:sz w:val="22"/>
-          <w:szCs w:val="22"/>
-        </w:rPr>
-        <w:t>/</w:t>
-      </w:r>
-      <w:r>
-        <w:rPr>
-          <w:rFonts w:ascii="Calibri" w:eastAsia="Calibri" w:hAnsi="Calibri" w:cs="Calibri"/>
-          <w:sz w:val="22"/>
-          <w:szCs w:val="22"/>
-        </w:rPr>
-        <w:t>&lt;user.name</w:t>
+        <w:t>https://github.com/&lt;user.name&gt;/&lt;user.name</w:t>
       </w:r>
       <w:proofErr w:type="gramStart"/>
       <w:r>
@@ -1681,15 +1542,7 @@
           <w:sz w:val="22"/>
           <w:szCs w:val="22"/>
         </w:rPr>
-        <w:t>&gt;</w:t>
-      </w:r>
-      <w:r>
-        <w:rPr>
-          <w:rFonts w:ascii="Calibri" w:eastAsia="Calibri" w:hAnsi="Calibri" w:cs="Calibri"/>
-          <w:sz w:val="22"/>
-          <w:szCs w:val="22"/>
-        </w:rPr>
-        <w:t>.github.io</w:t>
+        <w:t>&gt;.github.io</w:t>
       </w:r>
       <w:proofErr w:type="gramEnd"/>
       <w:r>
@@ -1698,15 +1551,7 @@
           <w:sz w:val="22"/>
           <w:szCs w:val="22"/>
         </w:rPr>
-        <w:t>/actions</w:t>
-      </w:r>
-      <w:r>
-        <w:rPr>
-          <w:rFonts w:ascii="Calibri" w:eastAsia="Calibri" w:hAnsi="Calibri" w:cs="Calibri"/>
-          <w:sz w:val="22"/>
-          <w:szCs w:val="22"/>
-        </w:rPr>
-        <w:t xml:space="preserve">. </w:t>
+        <w:t xml:space="preserve">/actions. </w:t>
       </w:r>
     </w:p>
     <w:p>

</xml_diff>